<commit_message>
Update How to Use Client Relevance Studio_.docx
</commit_message>
<xml_diff>
--- a/How to Use Client Relevance Studio_.docx
+++ b/How to Use Client Relevance Studio_.docx
@@ -32,7 +32,7 @@
     </w:p>
     <w:sdt>
       <w:sdtPr>
-        <w:id w:val="-1638387838"/>
+        <w:id w:val="2016221945"/>
         <w:docPartObj>
           <w:docPartGallery w:val="Table of Contents"/>
           <w:docPartUnique w:val="1"/>
@@ -47,10 +47,19 @@
             </w:tabs>
             <w:spacing w:before="60" w:line="240" w:lineRule="auto"/>
             <w:rPr>
+              <w:rFonts w:ascii="Arial" w:cs="Arial" w:eastAsia="Arial" w:hAnsi="Arial"/>
               <w:b w:val="1"/>
               <w:bCs w:val="1"/>
+              <w:i w:val="0"/>
+              <w:iCs w:val="0"/>
+              <w:smallCaps w:val="0"/>
+              <w:strike w:val="0"/>
               <w:color w:val="000000"/>
+              <w:sz w:val="22"/>
+              <w:szCs w:val="22"/>
               <w:u w:val="none"/>
+              <w:shd w:fill="auto" w:val="clear"/>
+              <w:vertAlign w:val="baseline"/>
             </w:rPr>
           </w:pPr>
           <w:r>
@@ -95,10 +104,19 @@
             </w:tabs>
             <w:spacing w:before="60" w:line="240" w:lineRule="auto"/>
             <w:rPr>
+              <w:rFonts w:ascii="Arial" w:cs="Arial" w:eastAsia="Arial" w:hAnsi="Arial"/>
               <w:b w:val="1"/>
               <w:bCs w:val="1"/>
+              <w:i w:val="0"/>
+              <w:iCs w:val="0"/>
+              <w:smallCaps w:val="0"/>
+              <w:strike w:val="0"/>
               <w:color w:val="000000"/>
+              <w:sz w:val="22"/>
+              <w:szCs w:val="22"/>
               <w:u w:val="none"/>
+              <w:shd w:fill="auto" w:val="clear"/>
+              <w:vertAlign w:val="baseline"/>
             </w:rPr>
           </w:pPr>
           <w:hyperlink w:anchor="_dmnqd61jk3yl">
@@ -121,7 +139,7 @@
               </w:rPr>
               <w:t xml:space="preserve">The Interface at a Glance</w:t>
               <w:tab/>
-              <w:t xml:space="preserve">2</w:t>
+              <w:t xml:space="preserve">3</w:t>
             </w:r>
           </w:hyperlink>
           <w:r>
@@ -138,10 +156,19 @@
             </w:tabs>
             <w:spacing w:before="60" w:line="240" w:lineRule="auto"/>
             <w:rPr>
+              <w:rFonts w:ascii="Arial" w:cs="Arial" w:eastAsia="Arial" w:hAnsi="Arial"/>
               <w:b w:val="1"/>
               <w:bCs w:val="1"/>
+              <w:i w:val="0"/>
+              <w:iCs w:val="0"/>
+              <w:smallCaps w:val="0"/>
+              <w:strike w:val="0"/>
               <w:color w:val="000000"/>
+              <w:sz w:val="22"/>
+              <w:szCs w:val="22"/>
               <w:u w:val="none"/>
+              <w:shd w:fill="auto" w:val="clear"/>
+              <w:vertAlign w:val="baseline"/>
             </w:rPr>
           </w:pPr>
           <w:hyperlink w:anchor="_2mxo8lol4l0">
@@ -181,10 +208,19 @@
             </w:tabs>
             <w:spacing w:before="60" w:line="240" w:lineRule="auto"/>
             <w:rPr>
+              <w:rFonts w:ascii="Arial" w:cs="Arial" w:eastAsia="Arial" w:hAnsi="Arial"/>
               <w:b w:val="1"/>
               <w:bCs w:val="1"/>
+              <w:i w:val="0"/>
+              <w:iCs w:val="0"/>
+              <w:smallCaps w:val="0"/>
+              <w:strike w:val="0"/>
               <w:color w:val="000000"/>
+              <w:sz w:val="22"/>
+              <w:szCs w:val="22"/>
               <w:u w:val="none"/>
+              <w:shd w:fill="auto" w:val="clear"/>
+              <w:vertAlign w:val="baseline"/>
             </w:rPr>
           </w:pPr>
           <w:hyperlink w:anchor="_584rjoc7zz0x">
@@ -224,10 +260,19 @@
             </w:tabs>
             <w:spacing w:before="60" w:line="240" w:lineRule="auto"/>
             <w:rPr>
+              <w:rFonts w:ascii="Arial" w:cs="Arial" w:eastAsia="Arial" w:hAnsi="Arial"/>
               <w:b w:val="1"/>
               <w:bCs w:val="1"/>
+              <w:i w:val="0"/>
+              <w:iCs w:val="0"/>
+              <w:smallCaps w:val="0"/>
+              <w:strike w:val="0"/>
               <w:color w:val="000000"/>
+              <w:sz w:val="22"/>
+              <w:szCs w:val="22"/>
               <w:u w:val="none"/>
+              <w:shd w:fill="auto" w:val="clear"/>
+              <w:vertAlign w:val="baseline"/>
             </w:rPr>
           </w:pPr>
           <w:hyperlink w:anchor="_knenot68d5tv">
@@ -267,10 +312,19 @@
             </w:tabs>
             <w:spacing w:before="60" w:line="240" w:lineRule="auto"/>
             <w:rPr>
+              <w:rFonts w:ascii="Arial" w:cs="Arial" w:eastAsia="Arial" w:hAnsi="Arial"/>
               <w:b w:val="1"/>
               <w:bCs w:val="1"/>
+              <w:i w:val="0"/>
+              <w:iCs w:val="0"/>
+              <w:smallCaps w:val="0"/>
+              <w:strike w:val="0"/>
               <w:color w:val="000000"/>
+              <w:sz w:val="22"/>
+              <w:szCs w:val="22"/>
               <w:u w:val="none"/>
+              <w:shd w:fill="auto" w:val="clear"/>
+              <w:vertAlign w:val="baseline"/>
             </w:rPr>
           </w:pPr>
           <w:hyperlink w:anchor="_8wfdrsp6zh0">
@@ -310,10 +364,19 @@
             </w:tabs>
             <w:spacing w:before="60" w:line="240" w:lineRule="auto"/>
             <w:rPr>
+              <w:rFonts w:ascii="Arial" w:cs="Arial" w:eastAsia="Arial" w:hAnsi="Arial"/>
               <w:b w:val="1"/>
               <w:bCs w:val="1"/>
+              <w:i w:val="0"/>
+              <w:iCs w:val="0"/>
+              <w:smallCaps w:val="0"/>
+              <w:strike w:val="0"/>
               <w:color w:val="000000"/>
+              <w:sz w:val="22"/>
+              <w:szCs w:val="22"/>
               <w:u w:val="none"/>
+              <w:shd w:fill="auto" w:val="clear"/>
+              <w:vertAlign w:val="baseline"/>
             </w:rPr>
           </w:pPr>
           <w:hyperlink w:anchor="_uj3zd9wbi87m">
@@ -353,10 +416,19 @@
             </w:tabs>
             <w:spacing w:before="60" w:line="240" w:lineRule="auto"/>
             <w:rPr>
+              <w:rFonts w:ascii="Arial" w:cs="Arial" w:eastAsia="Arial" w:hAnsi="Arial"/>
               <w:b w:val="1"/>
               <w:bCs w:val="1"/>
+              <w:i w:val="0"/>
+              <w:iCs w:val="0"/>
+              <w:smallCaps w:val="0"/>
+              <w:strike w:val="0"/>
               <w:color w:val="000000"/>
+              <w:sz w:val="22"/>
+              <w:szCs w:val="22"/>
               <w:u w:val="none"/>
+              <w:shd w:fill="auto" w:val="clear"/>
+              <w:vertAlign w:val="baseline"/>
             </w:rPr>
           </w:pPr>
           <w:hyperlink w:anchor="_yc72m3eqotyh">
@@ -396,10 +468,19 @@
             </w:tabs>
             <w:spacing w:before="60" w:line="240" w:lineRule="auto"/>
             <w:rPr>
+              <w:rFonts w:ascii="Arial" w:cs="Arial" w:eastAsia="Arial" w:hAnsi="Arial"/>
               <w:b w:val="1"/>
               <w:bCs w:val="1"/>
+              <w:i w:val="0"/>
+              <w:iCs w:val="0"/>
+              <w:smallCaps w:val="0"/>
+              <w:strike w:val="0"/>
               <w:color w:val="000000"/>
+              <w:sz w:val="22"/>
+              <w:szCs w:val="22"/>
               <w:u w:val="none"/>
+              <w:shd w:fill="auto" w:val="clear"/>
+              <w:vertAlign w:val="baseline"/>
             </w:rPr>
           </w:pPr>
           <w:hyperlink w:anchor="_xuwaxyqmum85">
@@ -560,19 +641,103 @@
         <w:rPr>
           <w:rtl w:val="0"/>
         </w:rPr>
-        <w:t xml:space="preserve">Extract the downloaded </w:t>
-      </w:r>
-      <w:r>
-        <w:rPr>
-          <w:rtl w:val="0"/>
-        </w:rPr>
-        <w:t xml:space="preserve">.zip</w:t>
-      </w:r>
-      <w:r>
-        <w:rPr>
-          <w:rtl w:val="0"/>
-        </w:rPr>
-        <w:t xml:space="preserve"> file to a local folder.</w:t>
+        <w:t xml:space="preserve">Download and extract the .zip file to a local folder.</w:t>
+      </w:r>
+    </w:p>
+    <w:p>
+      <w:pPr>
+        <w:numPr>
+          <w:ilvl w:val="0"/>
+          <w:numId w:val="8"/>
+        </w:numPr>
+        <w:pBdr>
+          <w:top w:color="auto" w:space="0" w:sz="0" w:val="none"/>
+          <w:bottom w:color="auto" w:space="0" w:sz="0" w:val="none"/>
+          <w:right w:color="auto" w:space="0" w:sz="0" w:val="none"/>
+          <w:between w:color="auto" w:space="0" w:sz="0" w:val="none"/>
+        </w:pBdr>
+        <w:spacing w:after="0" w:afterAutospacing="0" w:lineRule="auto"/>
+        <w:ind w:left="720" w:hanging="360"/>
+        <w:rPr>
+          <w:color w:val="000000"/>
+        </w:rPr>
+      </w:pPr>
+      <w:r>
+        <w:rPr>
+          <w:b w:val="1"/>
+          <w:bCs w:val="1"/>
+          <w:rtl w:val="0"/>
+        </w:rPr>
+        <w:t xml:space="preserve">Prerequisite Check</w:t>
+      </w:r>
+      <w:r>
+        <w:rPr>
+          <w:rtl w:val="0"/>
+        </w:rPr>
+        <w:t xml:space="preserve">: * If BESClient is installed: The application will automatically detect your local engine path.</w:t>
+      </w:r>
+    </w:p>
+    <w:p>
+      <w:pPr>
+        <w:numPr>
+          <w:ilvl w:val="0"/>
+          <w:numId w:val="8"/>
+        </w:numPr>
+        <w:pBdr>
+          <w:top w:color="auto" w:space="0" w:sz="0" w:val="none"/>
+          <w:bottom w:color="auto" w:space="0" w:sz="0" w:val="none"/>
+          <w:right w:color="auto" w:space="0" w:sz="0" w:val="none"/>
+          <w:between w:color="auto" w:space="0" w:sz="0" w:val="none"/>
+        </w:pBdr>
+        <w:spacing w:after="0" w:afterAutospacing="0" w:lineRule="auto"/>
+        <w:ind w:left="720" w:hanging="360"/>
+        <w:rPr>
+          <w:color w:val="000000"/>
+        </w:rPr>
+      </w:pPr>
+      <w:r>
+        <w:rPr>
+          <w:b w:val="1"/>
+          <w:bCs w:val="1"/>
+          <w:rtl w:val="0"/>
+        </w:rPr>
+        <w:t xml:space="preserve">If BESClient is NOT installed</w:t>
+      </w:r>
+      <w:r>
+        <w:rPr>
+          <w:rtl w:val="0"/>
+        </w:rPr>
+        <w:t xml:space="preserve">: Download the standalone QnA utility from the BigFix Download Center ( </w:t>
+      </w:r>
+      <w:hyperlink r:id="rId6">
+        <w:r>
+          <w:rPr>
+            <w:color w:val="1155cc"/>
+            <w:u w:val="single"/>
+            <w:rtl w:val="0"/>
+          </w:rPr>
+          <w:t xml:space="preserve">https://support.bigfix.com/bes/install/downloadbes.html</w:t>
+        </w:r>
+      </w:hyperlink>
+      <w:r>
+        <w:rPr>
+          <w:rtl w:val="0"/>
+        </w:rPr>
+        <w:t xml:space="preserve"> ) and </w:t>
+      </w:r>
+      <w:r>
+        <w:rPr>
+          <w:b w:val="1"/>
+          <w:bCs w:val="1"/>
+          <w:rtl w:val="0"/>
+        </w:rPr>
+        <w:t xml:space="preserve">ensure qna.exe is placed in the exact same directory as Advanced_QNA.exe</w:t>
+      </w:r>
+      <w:r>
+        <w:rPr>
+          <w:rtl w:val="0"/>
+        </w:rPr>
+        <w:t xml:space="preserve">.</w:t>
       </w:r>
     </w:p>
     <w:p>
@@ -646,16 +811,16 @@
           <wp:inline distB="114300" distT="114300" distL="114300" distR="114300">
             <wp:extent cx="5943600" cy="4419600"/>
             <wp:effectExtent b="0" l="0" r="0" t="0"/>
-            <wp:docPr id="7" name="image5.png"/>
+            <wp:docPr id="7" name="image3.png"/>
             <a:graphic>
               <a:graphicData uri="http://schemas.openxmlformats.org/drawingml/2006/picture">
                 <pic:pic>
                   <pic:nvPicPr>
-                    <pic:cNvPr id="0" name="image5.png"/>
+                    <pic:cNvPr id="0" name="image3.png"/>
                     <pic:cNvPicPr preferRelativeResize="0"/>
                   </pic:nvPicPr>
                   <pic:blipFill>
-                    <a:blip r:embed="rId6"/>
+                    <a:blip r:embed="rId7"/>
                     <a:srcRect b="0" l="0" r="0" t="0"/>
                     <a:stretch>
                       <a:fillRect/>
@@ -873,16 +1038,16 @@
           <wp:inline distB="114300" distT="114300" distL="114300" distR="114300">
             <wp:extent cx="5943600" cy="3111500"/>
             <wp:effectExtent b="0" l="0" r="0" t="0"/>
-            <wp:docPr id="2" name="image8.png"/>
+            <wp:docPr id="2" name="image2.png"/>
             <a:graphic>
               <a:graphicData uri="http://schemas.openxmlformats.org/drawingml/2006/picture">
                 <pic:pic>
                   <pic:nvPicPr>
-                    <pic:cNvPr id="0" name="image8.png"/>
+                    <pic:cNvPr id="0" name="image2.png"/>
                     <pic:cNvPicPr preferRelativeResize="0"/>
                   </pic:nvPicPr>
                   <pic:blipFill>
-                    <a:blip r:embed="rId7"/>
+                    <a:blip r:embed="rId8"/>
                     <a:srcRect b="0" l="0" r="0" t="0"/>
                     <a:stretch>
                       <a:fillRect/>
@@ -1120,16 +1285,16 @@
           <wp:inline distB="114300" distT="114300" distL="114300" distR="114300">
             <wp:extent cx="5943600" cy="3098800"/>
             <wp:effectExtent b="0" l="0" r="0" t="0"/>
-            <wp:docPr id="3" name="image2.png"/>
+            <wp:docPr id="3" name="image1.png"/>
             <a:graphic>
               <a:graphicData uri="http://schemas.openxmlformats.org/drawingml/2006/picture">
                 <pic:pic>
                   <pic:nvPicPr>
-                    <pic:cNvPr id="0" name="image2.png"/>
+                    <pic:cNvPr id="0" name="image1.png"/>
                     <pic:cNvPicPr preferRelativeResize="0"/>
                   </pic:nvPicPr>
                   <pic:blipFill>
-                    <a:blip r:embed="rId8"/>
+                    <a:blip r:embed="rId9"/>
                     <a:srcRect b="0" l="0" r="0" t="0"/>
                     <a:stretch>
                       <a:fillRect/>
@@ -1336,16 +1501,16 @@
           <wp:inline distB="114300" distT="114300" distL="114300" distR="114300">
             <wp:extent cx="5943600" cy="3136900"/>
             <wp:effectExtent b="0" l="0" r="0" t="0"/>
-            <wp:docPr id="5" name="image6.png"/>
+            <wp:docPr id="5" name="image4.png"/>
             <a:graphic>
               <a:graphicData uri="http://schemas.openxmlformats.org/drawingml/2006/picture">
                 <pic:pic>
                   <pic:nvPicPr>
-                    <pic:cNvPr id="0" name="image6.png"/>
+                    <pic:cNvPr id="0" name="image4.png"/>
                     <pic:cNvPicPr preferRelativeResize="0"/>
                   </pic:nvPicPr>
                   <pic:blipFill>
-                    <a:blip r:embed="rId9"/>
+                    <a:blip r:embed="rId10"/>
                     <a:srcRect b="0" l="0" r="0" t="0"/>
                     <a:stretch>
                       <a:fillRect/>
@@ -1388,16 +1553,16 @@
           <wp:inline distB="114300" distT="114300" distL="114300" distR="114300">
             <wp:extent cx="5943600" cy="3124200"/>
             <wp:effectExtent b="0" l="0" r="0" t="0"/>
-            <wp:docPr id="9" name="image1.png"/>
+            <wp:docPr id="9" name="image8.png"/>
             <a:graphic>
               <a:graphicData uri="http://schemas.openxmlformats.org/drawingml/2006/picture">
                 <pic:pic>
                   <pic:nvPicPr>
-                    <pic:cNvPr id="0" name="image1.png"/>
+                    <pic:cNvPr id="0" name="image8.png"/>
                     <pic:cNvPicPr preferRelativeResize="0"/>
                   </pic:nvPicPr>
                   <pic:blipFill>
-                    <a:blip r:embed="rId10"/>
+                    <a:blip r:embed="rId11"/>
                     <a:srcRect b="0" l="0" r="0" t="0"/>
                     <a:stretch>
                       <a:fillRect/>
@@ -1648,16 +1813,16 @@
           <wp:inline distB="114300" distT="114300" distL="114300" distR="114300">
             <wp:extent cx="5943600" cy="2476500"/>
             <wp:effectExtent b="0" l="0" r="0" t="0"/>
-            <wp:docPr id="4" name="image7.png"/>
+            <wp:docPr id="4" name="image6.png"/>
             <a:graphic>
               <a:graphicData uri="http://schemas.openxmlformats.org/drawingml/2006/picture">
                 <pic:pic>
                   <pic:nvPicPr>
-                    <pic:cNvPr id="0" name="image7.png"/>
+                    <pic:cNvPr id="0" name="image6.png"/>
                     <pic:cNvPicPr preferRelativeResize="0"/>
                   </pic:nvPicPr>
                   <pic:blipFill>
-                    <a:blip r:embed="rId11"/>
+                    <a:blip r:embed="rId12"/>
                     <a:srcRect b="0" l="0" r="0" t="0"/>
                     <a:stretch>
                       <a:fillRect/>
@@ -1886,179 +2051,6 @@
                 <pic:pic>
                   <pic:nvPicPr>
                     <pic:cNvPr id="0" name="image9.png"/>
-                    <pic:cNvPicPr preferRelativeResize="0"/>
-                  </pic:nvPicPr>
-                  <pic:blipFill>
-                    <a:blip r:embed="rId12"/>
-                    <a:srcRect b="0" l="0" r="0" t="0"/>
-                    <a:stretch>
-                      <a:fillRect/>
-                    </a:stretch>
-                  </pic:blipFill>
-                  <pic:spPr>
-                    <a:xfrm>
-                      <a:off x="0" y="0"/>
-                      <a:ext cx="5943600" cy="3124200"/>
-                    </a:xfrm>
-                    <a:prstGeom prst="rect"/>
-                    <a:ln/>
-                  </pic:spPr>
-                </pic:pic>
-              </a:graphicData>
-            </a:graphic>
-          </wp:inline>
-        </w:drawing>
-      </w:r>
-      <w:r>
-        <w:rPr>
-          <w:rtl w:val="0"/>
-        </w:rPr>
-      </w:r>
-    </w:p>
-    <w:p>
-      <w:pPr>
-        <w:pStyle w:val="Heading2"/>
-        <w:rPr/>
-      </w:pPr>
-      <w:bookmarkStart w:colFirst="0" w:colLast="0" w:name="_uj3zd9wbi87m" w:id="6"/>
-      <w:bookmarkEnd w:id="6"/>
-      <w:r>
-        <w:rPr>
-          <w:rtl w:val="0"/>
-        </w:rPr>
-        <w:t xml:space="preserve">Searching and Filtering Results</w:t>
-      </w:r>
-    </w:p>
-    <w:p>
-      <w:pPr>
-        <w:pBdr>
-          <w:top w:color="auto" w:space="0" w:sz="0" w:val="none"/>
-          <w:left w:color="auto" w:space="0" w:sz="0" w:val="none"/>
-          <w:bottom w:color="auto" w:space="0" w:sz="0" w:val="none"/>
-          <w:right w:color="auto" w:space="0" w:sz="0" w:val="none"/>
-          <w:between w:color="auto" w:space="0" w:sz="0" w:val="none"/>
-        </w:pBdr>
-        <w:spacing w:after="120" w:lineRule="auto"/>
-        <w:rPr/>
-      </w:pPr>
-      <w:r>
-        <w:rPr>
-          <w:rtl w:val="0"/>
-        </w:rPr>
-        <w:t xml:space="preserve">If your query returns hundreds of answers (like </w:t>
-      </w:r>
-      <w:r>
-        <w:rPr>
-          <w:rtl w:val="0"/>
-        </w:rPr>
-        <w:t xml:space="preserve">names of services</w:t>
-      </w:r>
-      <w:r>
-        <w:rPr>
-          <w:rtl w:val="0"/>
-        </w:rPr>
-        <w:t xml:space="preserve"> or </w:t>
-      </w:r>
-      <w:r>
-        <w:rPr>
-          <w:rtl w:val="0"/>
-        </w:rPr>
-        <w:t xml:space="preserve">names of files of folder "C:\"</w:t>
-      </w:r>
-      <w:r>
-        <w:rPr>
-          <w:rtl w:val="0"/>
-        </w:rPr>
-        <w:t xml:space="preserve">), finding a specific item can be tedious.</w:t>
-      </w:r>
-    </w:p>
-    <w:p>
-      <w:pPr>
-        <w:numPr>
-          <w:ilvl w:val="0"/>
-          <w:numId w:val="9"/>
-        </w:numPr>
-        <w:pBdr>
-          <w:top w:color="auto" w:space="0" w:sz="0" w:val="none"/>
-          <w:bottom w:color="auto" w:space="0" w:sz="0" w:val="none"/>
-          <w:right w:color="auto" w:space="0" w:sz="0" w:val="none"/>
-          <w:between w:color="auto" w:space="0" w:sz="0" w:val="none"/>
-        </w:pBdr>
-        <w:spacing w:after="0" w:afterAutospacing="0" w:lineRule="auto"/>
-        <w:ind w:left="720" w:hanging="360"/>
-        <w:rPr>
-          <w:color w:val="000000"/>
-        </w:rPr>
-      </w:pPr>
-      <w:r>
-        <w:rPr>
-          <w:rtl w:val="0"/>
-        </w:rPr>
-        <w:t xml:space="preserve">Use the </w:t>
-      </w:r>
-      <w:r>
-        <w:rPr>
-          <w:b w:val="1"/>
-          <w:bCs w:val="1"/>
-          <w:rtl w:val="0"/>
-        </w:rPr>
-        <w:t xml:space="preserve">"Search answers..."</w:t>
-      </w:r>
-      <w:r>
-        <w:rPr>
-          <w:rtl w:val="0"/>
-        </w:rPr>
-        <w:t xml:space="preserve"> input box in the Evaluation Results header.</w:t>
-      </w:r>
-    </w:p>
-    <w:p>
-      <w:pPr>
-        <w:numPr>
-          <w:ilvl w:val="0"/>
-          <w:numId w:val="9"/>
-        </w:numPr>
-        <w:pBdr>
-          <w:top w:color="auto" w:space="0" w:sz="0" w:val="none"/>
-          <w:bottom w:color="auto" w:space="0" w:sz="0" w:val="none"/>
-          <w:right w:color="auto" w:space="0" w:sz="0" w:val="none"/>
-          <w:between w:color="auto" w:space="0" w:sz="0" w:val="none"/>
-        </w:pBdr>
-        <w:spacing w:after="360" w:lineRule="auto"/>
-        <w:ind w:left="720" w:hanging="360"/>
-        <w:rPr>
-          <w:color w:val="000000"/>
-        </w:rPr>
-      </w:pPr>
-      <w:r>
-        <w:rPr>
-          <w:rtl w:val="0"/>
-        </w:rPr>
-        <w:t xml:space="preserve">Typing here will dynamically filter the result blocks in real-time, displaying only the rows that match your search and highlighting the matched text in yellow.</w:t>
-      </w:r>
-    </w:p>
-    <w:p>
-      <w:pPr>
-        <w:pBdr>
-          <w:top w:color="auto" w:space="0" w:sz="0" w:val="none"/>
-          <w:bottom w:color="auto" w:space="0" w:sz="0" w:val="none"/>
-          <w:right w:color="auto" w:space="0" w:sz="0" w:val="none"/>
-          <w:between w:color="auto" w:space="0" w:sz="0" w:val="none"/>
-        </w:pBdr>
-        <w:spacing w:after="360" w:lineRule="auto"/>
-        <w:rPr/>
-      </w:pPr>
-      <w:r>
-        <w:rPr/>
-        <w:drawing>
-          <wp:inline distB="114300" distT="114300" distL="114300" distR="114300">
-            <wp:extent cx="5943600" cy="3124200"/>
-            <wp:effectExtent b="0" l="0" r="0" t="0"/>
-            <wp:docPr id="1" name="image4.png"/>
-            <a:graphic>
-              <a:graphicData uri="http://schemas.openxmlformats.org/drawingml/2006/picture">
-                <pic:pic>
-                  <pic:nvPicPr>
-                    <pic:cNvPr id="0" name="image4.png"/>
                     <pic:cNvPicPr preferRelativeResize="0"/>
                   </pic:nvPicPr>
                   <pic:blipFill>
@@ -2093,13 +2085,13 @@
         <w:pStyle w:val="Heading2"/>
         <w:rPr/>
       </w:pPr>
-      <w:bookmarkStart w:colFirst="0" w:colLast="0" w:name="_yc72m3eqotyh" w:id="7"/>
-      <w:bookmarkEnd w:id="7"/>
-      <w:r>
-        <w:rPr>
-          <w:rtl w:val="0"/>
-        </w:rPr>
-        <w:t xml:space="preserve">Exporting Your Data</w:t>
+      <w:bookmarkStart w:colFirst="0" w:colLast="0" w:name="_uj3zd9wbi87m" w:id="6"/>
+      <w:bookmarkEnd w:id="6"/>
+      <w:r>
+        <w:rPr>
+          <w:rtl w:val="0"/>
+        </w:rPr>
+        <w:t xml:space="preserve">Searching and Filtering Results</w:t>
       </w:r>
     </w:p>
     <w:p>
@@ -2118,14 +2110,38 @@
         <w:rPr>
           <w:rtl w:val="0"/>
         </w:rPr>
-        <w:t xml:space="preserve">Need to share your findings with a colleague or attach them to a ticket?</w:t>
+        <w:t xml:space="preserve">If your query returns hundreds of answers (like </w:t>
+      </w:r>
+      <w:r>
+        <w:rPr>
+          <w:rtl w:val="0"/>
+        </w:rPr>
+        <w:t xml:space="preserve">names of services</w:t>
+      </w:r>
+      <w:r>
+        <w:rPr>
+          <w:rtl w:val="0"/>
+        </w:rPr>
+        <w:t xml:space="preserve"> or </w:t>
+      </w:r>
+      <w:r>
+        <w:rPr>
+          <w:rtl w:val="0"/>
+        </w:rPr>
+        <w:t xml:space="preserve">names of files of folder "C:\"</w:t>
+      </w:r>
+      <w:r>
+        <w:rPr>
+          <w:rtl w:val="0"/>
+        </w:rPr>
+        <w:t xml:space="preserve">), finding a specific item can be tedious.</w:t>
       </w:r>
     </w:p>
     <w:p>
       <w:pPr>
         <w:numPr>
           <w:ilvl w:val="0"/>
-          <w:numId w:val="7"/>
+          <w:numId w:val="9"/>
         </w:numPr>
         <w:pBdr>
           <w:top w:color="auto" w:space="0" w:sz="0" w:val="none"/>
@@ -2143,7 +2159,7 @@
         <w:rPr>
           <w:rtl w:val="0"/>
         </w:rPr>
-        <w:t xml:space="preserve">Click the </w:t>
+        <w:t xml:space="preserve">Use the </w:t>
       </w:r>
       <w:r>
         <w:rPr>
@@ -2151,164 +2167,20 @@
           <w:bCs w:val="1"/>
           <w:rtl w:val="0"/>
         </w:rPr>
-        <w:t xml:space="preserve">Export</w:t>
-      </w:r>
-      <w:r>
-        <w:rPr>
-          <w:rtl w:val="0"/>
-        </w:rPr>
-        <w:t xml:space="preserve"> button in the Evaluation Results header.</w:t>
+        <w:t xml:space="preserve">"Search answers..."</w:t>
+      </w:r>
+      <w:r>
+        <w:rPr>
+          <w:rtl w:val="0"/>
+        </w:rPr>
+        <w:t xml:space="preserve"> input box in the Evaluation Results header.</w:t>
       </w:r>
     </w:p>
     <w:p>
       <w:pPr>
         <w:numPr>
           <w:ilvl w:val="0"/>
-          <w:numId w:val="7"/>
-        </w:numPr>
-        <w:pBdr>
-          <w:top w:color="auto" w:space="0" w:sz="0" w:val="none"/>
-          <w:bottom w:color="auto" w:space="0" w:sz="0" w:val="none"/>
-          <w:right w:color="auto" w:space="0" w:sz="0" w:val="none"/>
-          <w:between w:color="auto" w:space="0" w:sz="0" w:val="none"/>
-        </w:pBdr>
-        <w:spacing w:after="0" w:afterAutospacing="0" w:lineRule="auto"/>
-        <w:ind w:left="720" w:hanging="360"/>
-        <w:rPr>
-          <w:color w:val="000000"/>
-        </w:rPr>
-      </w:pPr>
-      <w:r>
-        <w:rPr>
-          <w:rtl w:val="0"/>
-        </w:rPr>
-        <w:t xml:space="preserve">Select your desired format: </w:t>
-      </w:r>
-      <w:r>
-        <w:rPr>
-          <w:b w:val="1"/>
-          <w:bCs w:val="1"/>
-          <w:rtl w:val="0"/>
-        </w:rPr>
-        <w:t xml:space="preserve">CSV, PDF, HTML, TXT, JSON, or XML</w:t>
-      </w:r>
-      <w:r>
-        <w:rPr>
-          <w:rtl w:val="0"/>
-        </w:rPr>
-        <w:t xml:space="preserve">.</w:t>
-      </w:r>
-    </w:p>
-    <w:p>
-      <w:pPr>
-        <w:numPr>
-          <w:ilvl w:val="0"/>
-          <w:numId w:val="7"/>
-        </w:numPr>
-        <w:pBdr>
-          <w:top w:color="auto" w:space="0" w:sz="0" w:val="none"/>
-          <w:bottom w:color="auto" w:space="0" w:sz="0" w:val="none"/>
-          <w:right w:color="auto" w:space="0" w:sz="0" w:val="none"/>
-          <w:between w:color="auto" w:space="0" w:sz="0" w:val="none"/>
-        </w:pBdr>
-        <w:spacing w:after="0" w:afterAutospacing="0" w:lineRule="auto"/>
-        <w:ind w:left="720" w:hanging="360"/>
-        <w:rPr>
-          <w:color w:val="000000"/>
-        </w:rPr>
-      </w:pPr>
-      <w:r>
-        <w:rPr>
-          <w:rtl w:val="0"/>
-        </w:rPr>
-        <w:t xml:space="preserve">Choose your scope:</w:t>
-      </w:r>
-    </w:p>
-    <w:p>
-      <w:pPr>
-        <w:numPr>
-          <w:ilvl w:val="1"/>
-          <w:numId w:val="7"/>
-        </w:numPr>
-        <w:pBdr>
-          <w:top w:color="auto" w:space="0" w:sz="0" w:val="none"/>
-          <w:bottom w:color="auto" w:space="0" w:sz="0" w:val="none"/>
-          <w:right w:color="auto" w:space="0" w:sz="0" w:val="none"/>
-          <w:between w:color="auto" w:space="0" w:sz="0" w:val="none"/>
-        </w:pBdr>
-        <w:spacing w:after="0" w:afterAutospacing="0" w:lineRule="auto"/>
-        <w:ind w:left="1440" w:hanging="360"/>
-        <w:rPr>
-          <w:color w:val="000000"/>
-        </w:rPr>
-      </w:pPr>
-      <w:r>
-        <w:rPr>
-          <w:b w:val="1"/>
-          <w:bCs w:val="1"/>
-          <w:rtl w:val="0"/>
-        </w:rPr>
-        <w:t xml:space="preserve">Search Results:</w:t>
-      </w:r>
-      <w:r>
-        <w:rPr>
-          <w:rtl w:val="0"/>
-        </w:rPr>
-        <w:t xml:space="preserve"> If you have typed something into the "Search answers..." filter, this option will </w:t>
-      </w:r>
-      <w:r>
-        <w:rPr>
-          <w:i w:val="1"/>
-          <w:iCs w:val="1"/>
-          <w:rtl w:val="0"/>
-        </w:rPr>
-        <w:t xml:space="preserve">only</w:t>
-      </w:r>
-      <w:r>
-        <w:rPr>
-          <w:rtl w:val="0"/>
-        </w:rPr>
-        <w:t xml:space="preserve"> export the lines that currently match your search.</w:t>
-      </w:r>
-    </w:p>
-    <w:p>
-      <w:pPr>
-        <w:numPr>
-          <w:ilvl w:val="1"/>
-          <w:numId w:val="7"/>
-        </w:numPr>
-        <w:pBdr>
-          <w:top w:color="auto" w:space="0" w:sz="0" w:val="none"/>
-          <w:bottom w:color="auto" w:space="0" w:sz="0" w:val="none"/>
-          <w:right w:color="auto" w:space="0" w:sz="0" w:val="none"/>
-          <w:between w:color="auto" w:space="0" w:sz="0" w:val="none"/>
-        </w:pBdr>
-        <w:spacing w:after="0" w:afterAutospacing="0" w:lineRule="auto"/>
-        <w:ind w:left="1440" w:hanging="360"/>
-        <w:rPr>
-          <w:color w:val="000000"/>
-        </w:rPr>
-      </w:pPr>
-      <w:r>
-        <w:rPr>
-          <w:b w:val="1"/>
-          <w:bCs w:val="1"/>
-          <w:rtl w:val="0"/>
-        </w:rPr>
-        <w:t xml:space="preserve">All Results:</w:t>
-      </w:r>
-      <w:r>
-        <w:rPr>
-          <w:rtl w:val="0"/>
-        </w:rPr>
-        <w:t xml:space="preserve"> Exports everything currently rendered in the bottom pane, ignoring the search filter.</w:t>
-      </w:r>
-    </w:p>
-    <w:p>
-      <w:pPr>
-        <w:numPr>
-          <w:ilvl w:val="0"/>
-          <w:numId w:val="7"/>
+          <w:numId w:val="9"/>
         </w:numPr>
         <w:pBdr>
           <w:top w:color="auto" w:space="0" w:sz="0" w:val="none"/>
@@ -2326,7 +2198,7 @@
         <w:rPr>
           <w:rtl w:val="0"/>
         </w:rPr>
-        <w:t xml:space="preserve">A save dialog will prompt you to save the file to your local machine.</w:t>
+        <w:t xml:space="preserve">Typing here will dynamically filter the result blocks in real-time, displaying only the rows that match your search and highlighting the matched text in yellow.</w:t>
       </w:r>
     </w:p>
     <w:p>
@@ -2346,16 +2218,309 @@
           <wp:inline distB="114300" distT="114300" distL="114300" distR="114300">
             <wp:extent cx="5943600" cy="3124200"/>
             <wp:effectExtent b="0" l="0" r="0" t="0"/>
-            <wp:docPr id="6" name="image3.png"/>
+            <wp:docPr id="1" name="image7.png"/>
             <a:graphic>
               <a:graphicData uri="http://schemas.openxmlformats.org/drawingml/2006/picture">
                 <pic:pic>
                   <pic:nvPicPr>
-                    <pic:cNvPr id="0" name="image3.png"/>
+                    <pic:cNvPr id="0" name="image7.png"/>
                     <pic:cNvPicPr preferRelativeResize="0"/>
                   </pic:nvPicPr>
                   <pic:blipFill>
                     <a:blip r:embed="rId14"/>
+                    <a:srcRect b="0" l="0" r="0" t="0"/>
+                    <a:stretch>
+                      <a:fillRect/>
+                    </a:stretch>
+                  </pic:blipFill>
+                  <pic:spPr>
+                    <a:xfrm>
+                      <a:off x="0" y="0"/>
+                      <a:ext cx="5943600" cy="3124200"/>
+                    </a:xfrm>
+                    <a:prstGeom prst="rect"/>
+                    <a:ln/>
+                  </pic:spPr>
+                </pic:pic>
+              </a:graphicData>
+            </a:graphic>
+          </wp:inline>
+        </w:drawing>
+      </w:r>
+      <w:r>
+        <w:rPr>
+          <w:rtl w:val="0"/>
+        </w:rPr>
+      </w:r>
+    </w:p>
+    <w:p>
+      <w:pPr>
+        <w:pStyle w:val="Heading2"/>
+        <w:rPr/>
+      </w:pPr>
+      <w:bookmarkStart w:colFirst="0" w:colLast="0" w:name="_yc72m3eqotyh" w:id="7"/>
+      <w:bookmarkEnd w:id="7"/>
+      <w:r>
+        <w:rPr>
+          <w:rtl w:val="0"/>
+        </w:rPr>
+        <w:t xml:space="preserve">Exporting Your Data</w:t>
+      </w:r>
+    </w:p>
+    <w:p>
+      <w:pPr>
+        <w:pBdr>
+          <w:top w:color="auto" w:space="0" w:sz="0" w:val="none"/>
+          <w:left w:color="auto" w:space="0" w:sz="0" w:val="none"/>
+          <w:bottom w:color="auto" w:space="0" w:sz="0" w:val="none"/>
+          <w:right w:color="auto" w:space="0" w:sz="0" w:val="none"/>
+          <w:between w:color="auto" w:space="0" w:sz="0" w:val="none"/>
+        </w:pBdr>
+        <w:spacing w:after="120" w:lineRule="auto"/>
+        <w:rPr/>
+      </w:pPr>
+      <w:r>
+        <w:rPr>
+          <w:rtl w:val="0"/>
+        </w:rPr>
+        <w:t xml:space="preserve">Need to share your findings with a colleague or attach them to a ticket?</w:t>
+      </w:r>
+    </w:p>
+    <w:p>
+      <w:pPr>
+        <w:numPr>
+          <w:ilvl w:val="0"/>
+          <w:numId w:val="7"/>
+        </w:numPr>
+        <w:pBdr>
+          <w:top w:color="auto" w:space="0" w:sz="0" w:val="none"/>
+          <w:bottom w:color="auto" w:space="0" w:sz="0" w:val="none"/>
+          <w:right w:color="auto" w:space="0" w:sz="0" w:val="none"/>
+          <w:between w:color="auto" w:space="0" w:sz="0" w:val="none"/>
+        </w:pBdr>
+        <w:spacing w:after="0" w:afterAutospacing="0" w:lineRule="auto"/>
+        <w:ind w:left="720" w:hanging="360"/>
+        <w:rPr>
+          <w:color w:val="000000"/>
+        </w:rPr>
+      </w:pPr>
+      <w:r>
+        <w:rPr>
+          <w:rtl w:val="0"/>
+        </w:rPr>
+        <w:t xml:space="preserve">Click the </w:t>
+      </w:r>
+      <w:r>
+        <w:rPr>
+          <w:b w:val="1"/>
+          <w:bCs w:val="1"/>
+          <w:rtl w:val="0"/>
+        </w:rPr>
+        <w:t xml:space="preserve">Export</w:t>
+      </w:r>
+      <w:r>
+        <w:rPr>
+          <w:rtl w:val="0"/>
+        </w:rPr>
+        <w:t xml:space="preserve"> button in the Evaluation Results header.</w:t>
+      </w:r>
+    </w:p>
+    <w:p>
+      <w:pPr>
+        <w:numPr>
+          <w:ilvl w:val="0"/>
+          <w:numId w:val="7"/>
+        </w:numPr>
+        <w:pBdr>
+          <w:top w:color="auto" w:space="0" w:sz="0" w:val="none"/>
+          <w:bottom w:color="auto" w:space="0" w:sz="0" w:val="none"/>
+          <w:right w:color="auto" w:space="0" w:sz="0" w:val="none"/>
+          <w:between w:color="auto" w:space="0" w:sz="0" w:val="none"/>
+        </w:pBdr>
+        <w:spacing w:after="0" w:afterAutospacing="0" w:lineRule="auto"/>
+        <w:ind w:left="720" w:hanging="360"/>
+        <w:rPr>
+          <w:color w:val="000000"/>
+        </w:rPr>
+      </w:pPr>
+      <w:r>
+        <w:rPr>
+          <w:rtl w:val="0"/>
+        </w:rPr>
+        <w:t xml:space="preserve">Select your desired format: </w:t>
+      </w:r>
+      <w:r>
+        <w:rPr>
+          <w:b w:val="1"/>
+          <w:bCs w:val="1"/>
+          <w:rtl w:val="0"/>
+        </w:rPr>
+        <w:t xml:space="preserve">CSV, PDF, HTML, TXT, JSON, or XML</w:t>
+      </w:r>
+      <w:r>
+        <w:rPr>
+          <w:rtl w:val="0"/>
+        </w:rPr>
+        <w:t xml:space="preserve">.</w:t>
+      </w:r>
+    </w:p>
+    <w:p>
+      <w:pPr>
+        <w:numPr>
+          <w:ilvl w:val="0"/>
+          <w:numId w:val="7"/>
+        </w:numPr>
+        <w:pBdr>
+          <w:top w:color="auto" w:space="0" w:sz="0" w:val="none"/>
+          <w:bottom w:color="auto" w:space="0" w:sz="0" w:val="none"/>
+          <w:right w:color="auto" w:space="0" w:sz="0" w:val="none"/>
+          <w:between w:color="auto" w:space="0" w:sz="0" w:val="none"/>
+        </w:pBdr>
+        <w:spacing w:after="0" w:afterAutospacing="0" w:lineRule="auto"/>
+        <w:ind w:left="720" w:hanging="360"/>
+        <w:rPr>
+          <w:color w:val="000000"/>
+        </w:rPr>
+      </w:pPr>
+      <w:r>
+        <w:rPr>
+          <w:rtl w:val="0"/>
+        </w:rPr>
+        <w:t xml:space="preserve">Choose your scope:</w:t>
+      </w:r>
+    </w:p>
+    <w:p>
+      <w:pPr>
+        <w:numPr>
+          <w:ilvl w:val="1"/>
+          <w:numId w:val="7"/>
+        </w:numPr>
+        <w:pBdr>
+          <w:top w:color="auto" w:space="0" w:sz="0" w:val="none"/>
+          <w:bottom w:color="auto" w:space="0" w:sz="0" w:val="none"/>
+          <w:right w:color="auto" w:space="0" w:sz="0" w:val="none"/>
+          <w:between w:color="auto" w:space="0" w:sz="0" w:val="none"/>
+        </w:pBdr>
+        <w:spacing w:after="0" w:afterAutospacing="0" w:lineRule="auto"/>
+        <w:ind w:left="1440" w:hanging="360"/>
+        <w:rPr>
+          <w:color w:val="000000"/>
+        </w:rPr>
+      </w:pPr>
+      <w:r>
+        <w:rPr>
+          <w:b w:val="1"/>
+          <w:bCs w:val="1"/>
+          <w:rtl w:val="0"/>
+        </w:rPr>
+        <w:t xml:space="preserve">Search Results:</w:t>
+      </w:r>
+      <w:r>
+        <w:rPr>
+          <w:rtl w:val="0"/>
+        </w:rPr>
+        <w:t xml:space="preserve"> If you have typed something into the "Search answers..." filter, this option will </w:t>
+      </w:r>
+      <w:r>
+        <w:rPr>
+          <w:i w:val="1"/>
+          <w:iCs w:val="1"/>
+          <w:rtl w:val="0"/>
+        </w:rPr>
+        <w:t xml:space="preserve">only</w:t>
+      </w:r>
+      <w:r>
+        <w:rPr>
+          <w:rtl w:val="0"/>
+        </w:rPr>
+        <w:t xml:space="preserve"> export the lines that currently match your search.</w:t>
+      </w:r>
+    </w:p>
+    <w:p>
+      <w:pPr>
+        <w:numPr>
+          <w:ilvl w:val="1"/>
+          <w:numId w:val="7"/>
+        </w:numPr>
+        <w:pBdr>
+          <w:top w:color="auto" w:space="0" w:sz="0" w:val="none"/>
+          <w:bottom w:color="auto" w:space="0" w:sz="0" w:val="none"/>
+          <w:right w:color="auto" w:space="0" w:sz="0" w:val="none"/>
+          <w:between w:color="auto" w:space="0" w:sz="0" w:val="none"/>
+        </w:pBdr>
+        <w:spacing w:after="0" w:afterAutospacing="0" w:lineRule="auto"/>
+        <w:ind w:left="1440" w:hanging="360"/>
+        <w:rPr>
+          <w:color w:val="000000"/>
+        </w:rPr>
+      </w:pPr>
+      <w:r>
+        <w:rPr>
+          <w:b w:val="1"/>
+          <w:bCs w:val="1"/>
+          <w:rtl w:val="0"/>
+        </w:rPr>
+        <w:t xml:space="preserve">All Results:</w:t>
+      </w:r>
+      <w:r>
+        <w:rPr>
+          <w:rtl w:val="0"/>
+        </w:rPr>
+        <w:t xml:space="preserve"> Exports everything currently rendered in the bottom pane, ignoring the search filter.</w:t>
+      </w:r>
+    </w:p>
+    <w:p>
+      <w:pPr>
+        <w:numPr>
+          <w:ilvl w:val="0"/>
+          <w:numId w:val="7"/>
+        </w:numPr>
+        <w:pBdr>
+          <w:top w:color="auto" w:space="0" w:sz="0" w:val="none"/>
+          <w:bottom w:color="auto" w:space="0" w:sz="0" w:val="none"/>
+          <w:right w:color="auto" w:space="0" w:sz="0" w:val="none"/>
+          <w:between w:color="auto" w:space="0" w:sz="0" w:val="none"/>
+        </w:pBdr>
+        <w:spacing w:after="360" w:lineRule="auto"/>
+        <w:ind w:left="720" w:hanging="360"/>
+        <w:rPr>
+          <w:color w:val="000000"/>
+        </w:rPr>
+      </w:pPr>
+      <w:r>
+        <w:rPr>
+          <w:rtl w:val="0"/>
+        </w:rPr>
+        <w:t xml:space="preserve">A save dialog will prompt you to save the file to your local machine.</w:t>
+      </w:r>
+    </w:p>
+    <w:p>
+      <w:pPr>
+        <w:pBdr>
+          <w:top w:color="auto" w:space="0" w:sz="0" w:val="none"/>
+          <w:bottom w:color="auto" w:space="0" w:sz="0" w:val="none"/>
+          <w:right w:color="auto" w:space="0" w:sz="0" w:val="none"/>
+          <w:between w:color="auto" w:space="0" w:sz="0" w:val="none"/>
+        </w:pBdr>
+        <w:spacing w:after="360" w:lineRule="auto"/>
+        <w:rPr/>
+      </w:pPr>
+      <w:r>
+        <w:rPr/>
+        <w:drawing>
+          <wp:inline distB="114300" distT="114300" distL="114300" distR="114300">
+            <wp:extent cx="5943600" cy="3124200"/>
+            <wp:effectExtent b="0" l="0" r="0" t="0"/>
+            <wp:docPr id="6" name="image5.png"/>
+            <a:graphic>
+              <a:graphicData uri="http://schemas.openxmlformats.org/drawingml/2006/picture">
+                <pic:pic>
+                  <pic:nvPicPr>
+                    <pic:cNvPr id="0" name="image5.png"/>
+                    <pic:cNvPicPr preferRelativeResize="0"/>
+                  </pic:nvPicPr>
+                  <pic:blipFill>
+                    <a:blip r:embed="rId15"/>
                     <a:srcRect b="0" l="0" r="0" t="0"/>
                     <a:stretch>
                       <a:fillRect/>

</xml_diff>